<commit_message>
Update new view on NER
</commit_message>
<xml_diff>
--- a/writing/All about Data Sources.docx
+++ b/writing/All about Data Sources.docx
@@ -49,21 +49,19 @@
           <w:b/>
           <w:bCs/>
         </w:rPr>
-        <w:t>Annotation process</w:t>
-      </w:r>
-    </w:p>
-    <w:p>
-      <w:r>
-        <w:t>Manual</w:t>
-      </w:r>
-      <w:r>
-        <w:t xml:space="preserve">ly reviewing and extracting metadata from each thesis in the archive is not </w:t>
-      </w:r>
-      <w:r>
-        <w:t>only time-consuming and non-scalable, but also prone to human error. Therefore, a more efficient automatic approach based on deep learning models was explored.</w:t>
-      </w:r>
-      <w:r>
-        <w:t xml:space="preserve"> A dataset for training these models was built using a manual annotation procedure applied to a subset of twenty randomly selected theses.</w:t>
+        <w:t xml:space="preserve">Annotation </w:t>
+      </w:r>
+      <w:r>
+        <w:rPr>
+          <w:b/>
+          <w:bCs/>
+        </w:rPr>
+        <w:t>procedure</w:t>
+      </w:r>
+    </w:p>
+    <w:p>
+      <w:r>
+        <w:t>Manually reviewing and extracting metadata from each thesis in the archive is not only time-consuming and non-scalable, but also prone to human error. Therefore, a more efficient automatic approach based on deep learning models was explored. A dataset for training these models was built using a manual annotation procedure applied to a subset of twenty randomly selected theses.</w:t>
       </w:r>
     </w:p>
     <w:p>
@@ -107,15 +105,48 @@
         <w:t xml:space="preserve">INCEpTION, a </w:t>
       </w:r>
       <w:r>
-        <w:t>semantic annotation platform. One-word and multi-word spans were labeled in the text according to a pre-defined schema, shown in Table 1. These tags represent the key information to extract from the text</w:t>
-      </w:r>
-      <w:r>
-        <w:t xml:space="preserve"> (several more tags were annotated but their purposes are beyond the scope of this thesis, so they will be excluded from the discussion).</w:t>
-      </w:r>
-    </w:p>
-    <w:p>
-      <w:r>
-        <w:t xml:space="preserve">The annotations were completed by two subject-matter experts and a student assistant. Their task was guided by an annotation guide, which evolved as they became more familiar with the content in the texts. The annotations were represented in the BIO scheme used in the CoNLL format for chunking tokens, which labels multi-word entities with a -B for the beginning of a word and an -I for the center and end of a word </w:t>
+        <w:t xml:space="preserve">semantic annotation platform. One-word and multi-word spans were labeled in the text according to a pre-defined schema, shown in Table 1. These </w:t>
+      </w:r>
+      <w:r>
+        <w:t>labels</w:t>
+      </w:r>
+      <w:r>
+        <w:t xml:space="preserve"> represent the key information to extract from the text</w:t>
+      </w:r>
+      <w:r>
+        <w:t xml:space="preserve"> (several more </w:t>
+      </w:r>
+      <w:r>
+        <w:t>labels</w:t>
+      </w:r>
+      <w:r>
+        <w:t xml:space="preserve"> were annotated but their purposes are beyond the scope of this thesis, so they will be excluded from the discussion).</w:t>
+      </w:r>
+    </w:p>
+    <w:p>
+      <w:r>
+        <w:t xml:space="preserve">The annotations were completed by two subject-matter experts and a student assistant. Their task was guided by an annotation guide, which evolved as they became more familiar with the content </w:t>
+      </w:r>
+      <w:r>
+        <w:t>and structure of th</w:t>
+      </w:r>
+      <w:r>
+        <w:t xml:space="preserve">e texts. </w:t>
+      </w:r>
+      <w:r>
+        <w:t>Entities</w:t>
+      </w:r>
+      <w:r>
+        <w:t xml:space="preserve"> were represented in the BIO scheme used in the CoNLL format for chunking tokens, which labels multi-word entities with a -B for the beginning of a</w:t>
+      </w:r>
+      <w:r>
+        <w:t xml:space="preserve">n entity </w:t>
+      </w:r>
+      <w:r>
+        <w:t>and an -I for the center and end of a</w:t>
+      </w:r>
+      <w:r>
+        <w:t xml:space="preserve">n entity </w:t>
       </w:r>
       <w:r>
         <w:fldChar w:fldCharType="begin"/>
@@ -139,10 +170,13 @@
         <w:t>. None-</w:t>
       </w:r>
       <w:r>
-        <w:t>entity</w:t>
-      </w:r>
-      <w:r>
-        <w:t xml:space="preserve"> words are labeled with an O.</w:t>
+        <w:t>entit</w:t>
+      </w:r>
+      <w:r>
+        <w:t xml:space="preserve">ies </w:t>
+      </w:r>
+      <w:r>
+        <w:t>are labeled with an O.</w:t>
       </w:r>
     </w:p>
     <w:p>
@@ -879,22 +913,28 @@
         <w:t xml:space="preserve">The </w:t>
       </w:r>
       <w:r>
-        <w:t>labeled dataset</w:t>
-      </w:r>
-      <w:r>
-        <w:t xml:space="preserve"> w</w:t>
-      </w:r>
-      <w:r>
-        <w:t>as</w:t>
-      </w:r>
-      <w:r>
-        <w:t xml:space="preserve"> tested to assess </w:t>
+        <w:t>annotation procedure was analyzed</w:t>
+      </w:r>
+      <w:r>
+        <w:t xml:space="preserve"> to assess </w:t>
       </w:r>
       <w:r>
         <w:t>its</w:t>
       </w:r>
       <w:r>
-        <w:t xml:space="preserve"> suitability as reliable ground-truth for model training. An initial batch of five theses was annotated independently by each member of the project. Inter</w:t>
+        <w:t xml:space="preserve"> suitability </w:t>
+      </w:r>
+      <w:r>
+        <w:t>for producing a</w:t>
+      </w:r>
+      <w:r>
+        <w:t xml:space="preserve"> reliable ground-truth </w:t>
+      </w:r>
+      <w:r>
+        <w:t xml:space="preserve">dataset </w:t>
+      </w:r>
+      <w:r>
+        <w:t>for model training. An initial batch of five theses was annotated independently by each member of the project. Inter</w:t>
       </w:r>
       <w:r>
         <w:t>-</w:t>
@@ -929,16 +969,34 @@
         <w:t xml:space="preserve"> </w:t>
       </w:r>
       <w:r>
-        <w:t>Python package, which compares named entity annotations in terms of both label correctness and amount of span overlap with a reference entity. Precision, recall and F1 scores were reported with a lenient evaluation context in which partially overlapping entity spans with matching labels were considered correct. The tagged entities of one annotator, who served as the reference, were compared to each of the other two annotators.</w:t>
+        <w:t>Python package, which compares named entity annotations in terms of both label correctness and amount of span overlap with a reference entity. Precision, recall and F1 scores were reported with a lenient evaluation context in which partially overlapping entity spans with matching labels were considered correct</w:t>
+      </w:r>
+      <w:r>
+        <w:rPr>
+          <w:highlight w:val="yellow"/>
+        </w:rPr>
+        <w:t>.</w:t>
+      </w:r>
+      <w:r>
+        <w:rPr>
+          <w:highlight w:val="yellow"/>
+        </w:rPr>
+        <w:t>[Were other things corrected?]</w:t>
+      </w:r>
+      <w:r>
+        <w:t xml:space="preserve"> The </w:t>
+      </w:r>
+      <w:r>
+        <w:t>labeled</w:t>
+      </w:r>
+      <w:r>
+        <w:t xml:space="preserve"> entities of one annotator, who served as the reference, were compared to each of the other two annotators.</w:t>
       </w:r>
       <w:r>
         <w:t xml:space="preserve"> </w:t>
       </w:r>
       <w:r>
-        <w:t>The Inter-annotator agreement metrics show a pattern across labels</w:t>
-      </w:r>
-      <w:r>
-        <w:t xml:space="preserve">, shown in </w:t>
+        <w:t xml:space="preserve">The Inter-annotator agreement metrics show a pattern across labels, shown in </w:t>
       </w:r>
       <w:r>
         <w:fldChar w:fldCharType="begin"/>
@@ -962,13 +1020,16 @@
         <w:fldChar w:fldCharType="end"/>
       </w:r>
       <w:r>
-        <w:t xml:space="preserve">, </w:t>
-      </w:r>
-      <w:r>
-        <w:t>and across time</w:t>
-      </w:r>
-      <w:r>
-        <w:t>.</w:t>
+        <w:t>, and across time.</w:t>
+      </w:r>
+      <w:r>
+        <w:t xml:space="preserve"> Higher values indicate agreement between annotators, and lower values indicate </w:t>
+      </w:r>
+      <w:r>
+        <w:t>__</w:t>
+      </w:r>
+      <w:r>
+        <w:t xml:space="preserve"> in expert opinion.</w:t>
       </w:r>
     </w:p>
     <w:p>
@@ -990,7 +1051,19 @@
       </w:fldSimple>
       <w:bookmarkEnd w:id="3"/>
       <w:r>
-        <w:t>. Average metrics of inter-annotator agreement  on 5 theses</w:t>
+        <w:t xml:space="preserve">. Average </w:t>
+      </w:r>
+      <w:r>
+        <w:t>measures</w:t>
+      </w:r>
+      <w:r>
+        <w:t xml:space="preserve"> of inter-annotator </w:t>
+      </w:r>
+      <w:r>
+        <w:t>agreement on</w:t>
+      </w:r>
+      <w:r>
+        <w:t xml:space="preserve"> 5 theses</w:t>
       </w:r>
     </w:p>
     <w:tbl>
@@ -1040,7 +1113,6 @@
         <w:tc>
           <w:tcPr>
             <w:tcW w:w="1072" w:type="dxa"/>
-            <w:shd w:val="clear" w:color="000000" w:fill="DAE9F8"/>
             <w:noWrap/>
             <w:vAlign w:val="bottom"/>
             <w:hideMark/>
@@ -1074,7 +1146,6 @@
         <w:tc>
           <w:tcPr>
             <w:tcW w:w="860" w:type="dxa"/>
-            <w:shd w:val="clear" w:color="000000" w:fill="DAE9F8"/>
             <w:noWrap/>
             <w:vAlign w:val="bottom"/>
             <w:hideMark/>
@@ -1108,7 +1179,6 @@
         <w:tc>
           <w:tcPr>
             <w:tcW w:w="860" w:type="dxa"/>
-            <w:shd w:val="clear" w:color="000000" w:fill="DAE9F8"/>
             <w:noWrap/>
             <w:vAlign w:val="bottom"/>
             <w:hideMark/>
@@ -1173,25 +1243,13 @@
                 <w:kern w:val="0"/>
                 <w14:ligatures w14:val="none"/>
               </w:rPr>
-              <w:t>Overal</w:t>
-            </w:r>
-            <w:r>
-              <w:rPr>
-                <w:rFonts w:ascii="Aptos Narrow" w:eastAsia="Times New Roman" w:hAnsi="Aptos Narrow" w:cs="Times New Roman"/>
-                <w:b/>
-                <w:bCs/>
-                <w:color w:val="000000"/>
-                <w:kern w:val="0"/>
-                <w14:ligatures w14:val="none"/>
-              </w:rPr>
-              <w:t>l</w:t>
+              <w:t>Overall</w:t>
             </w:r>
           </w:p>
         </w:tc>
         <w:tc>
           <w:tcPr>
             <w:tcW w:w="1072" w:type="dxa"/>
-            <w:shd w:val="clear" w:color="000000" w:fill="DAE9F8"/>
             <w:noWrap/>
             <w:vAlign w:val="bottom"/>
             <w:hideMark/>
@@ -1221,7 +1279,6 @@
         <w:tc>
           <w:tcPr>
             <w:tcW w:w="860" w:type="dxa"/>
-            <w:shd w:val="clear" w:color="000000" w:fill="DAE9F8"/>
             <w:noWrap/>
             <w:vAlign w:val="bottom"/>
             <w:hideMark/>
@@ -1260,7 +1317,6 @@
         <w:tc>
           <w:tcPr>
             <w:tcW w:w="860" w:type="dxa"/>
-            <w:shd w:val="clear" w:color="000000" w:fill="DAE9F8"/>
             <w:noWrap/>
             <w:vAlign w:val="bottom"/>
             <w:hideMark/>
@@ -1295,6 +1351,7 @@
         <w:tc>
           <w:tcPr>
             <w:tcW w:w="2080" w:type="dxa"/>
+            <w:shd w:val="clear" w:color="auto" w:fill="D9F2D0" w:themeFill="accent6" w:themeFillTint="33"/>
             <w:noWrap/>
             <w:vAlign w:val="bottom"/>
             <w:hideMark/>
@@ -1324,7 +1381,7 @@
         <w:tc>
           <w:tcPr>
             <w:tcW w:w="1072" w:type="dxa"/>
-            <w:shd w:val="clear" w:color="000000" w:fill="DAE9F8"/>
+            <w:shd w:val="clear" w:color="auto" w:fill="D9F2D0" w:themeFill="accent6" w:themeFillTint="33"/>
             <w:noWrap/>
             <w:vAlign w:val="bottom"/>
             <w:hideMark/>
@@ -1354,7 +1411,7 @@
         <w:tc>
           <w:tcPr>
             <w:tcW w:w="860" w:type="dxa"/>
-            <w:shd w:val="clear" w:color="000000" w:fill="DAE9F8"/>
+            <w:shd w:val="clear" w:color="auto" w:fill="D9F2D0" w:themeFill="accent6" w:themeFillTint="33"/>
             <w:noWrap/>
             <w:vAlign w:val="bottom"/>
             <w:hideMark/>
@@ -1393,7 +1450,7 @@
         <w:tc>
           <w:tcPr>
             <w:tcW w:w="860" w:type="dxa"/>
-            <w:shd w:val="clear" w:color="000000" w:fill="DAE9F8"/>
+            <w:shd w:val="clear" w:color="auto" w:fill="D9F2D0" w:themeFill="accent6" w:themeFillTint="33"/>
             <w:noWrap/>
             <w:vAlign w:val="bottom"/>
             <w:hideMark/>
@@ -1428,6 +1485,7 @@
         <w:tc>
           <w:tcPr>
             <w:tcW w:w="2080" w:type="dxa"/>
+            <w:shd w:val="clear" w:color="auto" w:fill="D9F2D0" w:themeFill="accent6" w:themeFillTint="33"/>
             <w:noWrap/>
             <w:vAlign w:val="bottom"/>
             <w:hideMark/>
@@ -1457,7 +1515,7 @@
         <w:tc>
           <w:tcPr>
             <w:tcW w:w="1072" w:type="dxa"/>
-            <w:shd w:val="clear" w:color="000000" w:fill="DAE9F8"/>
+            <w:shd w:val="clear" w:color="auto" w:fill="D9F2D0" w:themeFill="accent6" w:themeFillTint="33"/>
             <w:noWrap/>
             <w:vAlign w:val="bottom"/>
             <w:hideMark/>
@@ -1487,7 +1545,7 @@
         <w:tc>
           <w:tcPr>
             <w:tcW w:w="860" w:type="dxa"/>
-            <w:shd w:val="clear" w:color="000000" w:fill="DAE9F8"/>
+            <w:shd w:val="clear" w:color="auto" w:fill="D9F2D0" w:themeFill="accent6" w:themeFillTint="33"/>
             <w:noWrap/>
             <w:vAlign w:val="bottom"/>
             <w:hideMark/>
@@ -1526,7 +1584,7 @@
         <w:tc>
           <w:tcPr>
             <w:tcW w:w="860" w:type="dxa"/>
-            <w:shd w:val="clear" w:color="000000" w:fill="DAE9F8"/>
+            <w:shd w:val="clear" w:color="auto" w:fill="D9F2D0" w:themeFill="accent6" w:themeFillTint="33"/>
             <w:noWrap/>
             <w:vAlign w:val="bottom"/>
             <w:hideMark/>
@@ -1561,6 +1619,7 @@
         <w:tc>
           <w:tcPr>
             <w:tcW w:w="2080" w:type="dxa"/>
+            <w:shd w:val="clear" w:color="auto" w:fill="D9F2D0" w:themeFill="accent6" w:themeFillTint="33"/>
             <w:noWrap/>
             <w:vAlign w:val="bottom"/>
           </w:tcPr>
@@ -1589,7 +1648,7 @@
         <w:tc>
           <w:tcPr>
             <w:tcW w:w="1072" w:type="dxa"/>
-            <w:shd w:val="clear" w:color="000000" w:fill="DAE9F8"/>
+            <w:shd w:val="clear" w:color="auto" w:fill="D9F2D0" w:themeFill="accent6" w:themeFillTint="33"/>
             <w:noWrap/>
             <w:vAlign w:val="bottom"/>
           </w:tcPr>
@@ -1627,7 +1686,7 @@
         <w:tc>
           <w:tcPr>
             <w:tcW w:w="860" w:type="dxa"/>
-            <w:shd w:val="clear" w:color="000000" w:fill="DAE9F8"/>
+            <w:shd w:val="clear" w:color="auto" w:fill="D9F2D0" w:themeFill="accent6" w:themeFillTint="33"/>
             <w:noWrap/>
             <w:vAlign w:val="bottom"/>
           </w:tcPr>
@@ -1656,7 +1715,7 @@
         <w:tc>
           <w:tcPr>
             <w:tcW w:w="860" w:type="dxa"/>
-            <w:shd w:val="clear" w:color="000000" w:fill="DAE9F8"/>
+            <w:shd w:val="clear" w:color="auto" w:fill="D9F2D0" w:themeFill="accent6" w:themeFillTint="33"/>
             <w:noWrap/>
             <w:vAlign w:val="bottom"/>
           </w:tcPr>
@@ -1690,6 +1749,7 @@
         <w:tc>
           <w:tcPr>
             <w:tcW w:w="2080" w:type="dxa"/>
+            <w:shd w:val="clear" w:color="auto" w:fill="FF9393"/>
             <w:noWrap/>
             <w:vAlign w:val="bottom"/>
             <w:hideMark/>
@@ -1719,7 +1779,7 @@
         <w:tc>
           <w:tcPr>
             <w:tcW w:w="1072" w:type="dxa"/>
-            <w:shd w:val="clear" w:color="000000" w:fill="DAE9F8"/>
+            <w:shd w:val="clear" w:color="auto" w:fill="FF9393"/>
             <w:noWrap/>
             <w:vAlign w:val="bottom"/>
             <w:hideMark/>
@@ -1749,7 +1809,7 @@
         <w:tc>
           <w:tcPr>
             <w:tcW w:w="860" w:type="dxa"/>
-            <w:shd w:val="clear" w:color="000000" w:fill="DAE9F8"/>
+            <w:shd w:val="clear" w:color="auto" w:fill="FF9393"/>
             <w:noWrap/>
             <w:vAlign w:val="bottom"/>
             <w:hideMark/>
@@ -1779,7 +1839,7 @@
         <w:tc>
           <w:tcPr>
             <w:tcW w:w="860" w:type="dxa"/>
-            <w:shd w:val="clear" w:color="000000" w:fill="DAE9F8"/>
+            <w:shd w:val="clear" w:color="auto" w:fill="FF9393"/>
             <w:noWrap/>
             <w:vAlign w:val="bottom"/>
             <w:hideMark/>
@@ -1814,6 +1874,7 @@
         <w:tc>
           <w:tcPr>
             <w:tcW w:w="2080" w:type="dxa"/>
+            <w:shd w:val="clear" w:color="auto" w:fill="FF9393"/>
             <w:noWrap/>
             <w:vAlign w:val="bottom"/>
           </w:tcPr>
@@ -1842,7 +1903,7 @@
         <w:tc>
           <w:tcPr>
             <w:tcW w:w="1072" w:type="dxa"/>
-            <w:shd w:val="clear" w:color="000000" w:fill="DAE9F8"/>
+            <w:shd w:val="clear" w:color="auto" w:fill="FF9393"/>
             <w:noWrap/>
             <w:vAlign w:val="bottom"/>
           </w:tcPr>
@@ -1871,7 +1932,7 @@
         <w:tc>
           <w:tcPr>
             <w:tcW w:w="860" w:type="dxa"/>
-            <w:shd w:val="clear" w:color="000000" w:fill="DAE9F8"/>
+            <w:shd w:val="clear" w:color="auto" w:fill="FF9393"/>
             <w:noWrap/>
             <w:vAlign w:val="bottom"/>
           </w:tcPr>
@@ -1909,7 +1970,7 @@
         <w:tc>
           <w:tcPr>
             <w:tcW w:w="860" w:type="dxa"/>
-            <w:shd w:val="clear" w:color="000000" w:fill="DAE9F8"/>
+            <w:shd w:val="clear" w:color="auto" w:fill="FF9393"/>
             <w:noWrap/>
             <w:vAlign w:val="bottom"/>
           </w:tcPr>
@@ -1952,6 +2013,7 @@
         <w:tc>
           <w:tcPr>
             <w:tcW w:w="2080" w:type="dxa"/>
+            <w:shd w:val="clear" w:color="auto" w:fill="FF9393"/>
             <w:noWrap/>
             <w:vAlign w:val="bottom"/>
             <w:hideMark/>
@@ -1981,7 +2043,7 @@
         <w:tc>
           <w:tcPr>
             <w:tcW w:w="1072" w:type="dxa"/>
-            <w:shd w:val="clear" w:color="000000" w:fill="DAE9F8"/>
+            <w:shd w:val="clear" w:color="auto" w:fill="FF9393"/>
             <w:noWrap/>
             <w:vAlign w:val="bottom"/>
             <w:hideMark/>
@@ -2011,7 +2073,7 @@
         <w:tc>
           <w:tcPr>
             <w:tcW w:w="860" w:type="dxa"/>
-            <w:shd w:val="clear" w:color="000000" w:fill="DAE9F8"/>
+            <w:shd w:val="clear" w:color="auto" w:fill="FF9393"/>
             <w:noWrap/>
             <w:vAlign w:val="bottom"/>
             <w:hideMark/>
@@ -2041,7 +2103,7 @@
         <w:tc>
           <w:tcPr>
             <w:tcW w:w="860" w:type="dxa"/>
-            <w:shd w:val="clear" w:color="000000" w:fill="DAE9F8"/>
+            <w:shd w:val="clear" w:color="auto" w:fill="FF9393"/>
             <w:noWrap/>
             <w:vAlign w:val="bottom"/>
             <w:hideMark/>
@@ -2089,6 +2151,14 @@
         <w:spacing w:line="259" w:lineRule="auto"/>
       </w:pPr>
       <w:r>
+        <w:t>[topic sentence]</w:t>
+      </w:r>
+    </w:p>
+    <w:p>
+      <w:pPr>
+        <w:spacing w:line="259" w:lineRule="auto"/>
+      </w:pPr>
+      <w:r>
         <w:t>T</w:t>
       </w:r>
       <w:r>
@@ -2128,31 +2198,203 @@
         <w:t xml:space="preserve">Issued </w:t>
       </w:r>
       <w:r>
-        <w:t xml:space="preserve">had </w:t>
-      </w:r>
-      <w:r>
-        <w:t>high scores in all metrics</w:t>
-      </w:r>
-      <w:r>
-        <w:t xml:space="preserve"> and perfect precision</w:t>
-      </w:r>
-      <w:r>
-        <w:t xml:space="preserve"> for some of the theses. </w:t>
-      </w:r>
-      <w:r>
-        <w:t>This aligns with expectations because t</w:t>
+        <w:t>achieved</w:t>
+      </w:r>
+      <w:r>
+        <w:t xml:space="preserve"> </w:t>
+      </w:r>
+      <w:r>
+        <w:t xml:space="preserve">high scores </w:t>
+      </w:r>
+      <w:r>
+        <w:t>across a</w:t>
+      </w:r>
+      <w:r>
+        <w:t>ll metrics</w:t>
+      </w:r>
+      <w:r>
+        <w:t xml:space="preserve">, with </w:t>
+      </w:r>
+      <w:r>
+        <w:t>perfect precision</w:t>
+      </w:r>
+      <w:r>
+        <w:t xml:space="preserve"> for </w:t>
+      </w:r>
+      <w:r>
+        <w:t>several</w:t>
+      </w:r>
+      <w:r>
+        <w:t xml:space="preserve"> theses. </w:t>
+      </w:r>
+      <w:r>
+        <w:t>This</w:t>
+      </w:r>
+      <w:r>
+        <w:t xml:space="preserve"> outcome</w:t>
+      </w:r>
+      <w:r>
+        <w:t xml:space="preserve"> aligns with expectations </w:t>
+      </w:r>
+      <w:r>
+        <w:t>since</w:t>
+      </w:r>
+      <w:r>
+        <w:t xml:space="preserve"> t</w:t>
       </w:r>
       <w:r>
         <w:t>hese labels are semantically unambiguous</w:t>
       </w:r>
       <w:r>
-        <w:t>; they are not subject to i</w:t>
-      </w:r>
-      <w:r>
-        <w:t>ndividual i</w:t>
-      </w:r>
-      <w:r>
-        <w:t>nterpretation. Where variation exists among authors  [which there was some, as seen in], it can be attributed to cases with unusual __ (a thesis with a title and a long subtitle) and level of detail (annotation of an instance of July 4, 1976 instead of an instance of July 1976).</w:t>
+        <w:t xml:space="preserve">; they are </w:t>
+      </w:r>
+      <w:r>
+        <w:t xml:space="preserve">well-defined and largely not subject to </w:t>
+      </w:r>
+      <w:r>
+        <w:t xml:space="preserve">individual </w:t>
+      </w:r>
+      <w:r>
+        <w:t>i</w:t>
+      </w:r>
+      <w:r>
+        <w:t>nterpretation. Where variation among authors</w:t>
+      </w:r>
+      <w:r>
+        <w:t xml:space="preserve"> did occur</w:t>
+      </w:r>
+      <w:r>
+        <w:t xml:space="preserve">, </w:t>
+      </w:r>
+      <w:r>
+        <w:t xml:space="preserve">it </w:t>
+      </w:r>
+      <w:r>
+        <w:t xml:space="preserve">can be attributed to </w:t>
+      </w:r>
+      <w:r>
+        <w:t xml:space="preserve">ambiguities in the guidelines rather than conceptual disagreement. </w:t>
+      </w:r>
+      <w:r>
+        <w:t xml:space="preserve">Observed discrepancies </w:t>
+      </w:r>
+      <w:r>
+        <w:t>arose from</w:t>
+      </w:r>
+      <w:r>
+        <w:t xml:space="preserve"> unspecified labeling rules </w:t>
+      </w:r>
+      <w:r>
+        <w:t>(</w:t>
+      </w:r>
+      <w:r>
+        <w:t>e</w:t>
+      </w:r>
+      <w:r>
+        <w:t>.g</w:t>
+      </w:r>
+      <w:r>
+        <w:t>. how</w:t>
+      </w:r>
+      <w:r>
+        <w:t xml:space="preserve"> </w:t>
+      </w:r>
+      <w:r>
+        <w:t>handle</w:t>
+      </w:r>
+      <w:r>
+        <w:t xml:space="preserve"> subtitle</w:t>
+      </w:r>
+      <w:r>
+        <w:t>s</w:t>
+      </w:r>
+      <w:r>
+        <w:t>)</w:t>
+      </w:r>
+      <w:r>
+        <w:t xml:space="preserve">, </w:t>
+      </w:r>
+      <w:r>
+        <w:t>differences in granularity</w:t>
+      </w:r>
+      <w:r>
+        <w:t xml:space="preserve"> (</w:t>
+      </w:r>
+      <w:r>
+        <w:t>e</w:t>
+      </w:r>
+      <w:r>
+        <w:t>.g</w:t>
+      </w:r>
+      <w:r>
+        <w:t xml:space="preserve">. assigning the label </w:t>
+      </w:r>
+      <w:r>
+        <w:rPr>
+          <w:i/>
+          <w:iCs/>
+        </w:rPr>
+        <w:t>issued</w:t>
+      </w:r>
+      <w:r>
+        <w:t xml:space="preserve"> to “</w:t>
+      </w:r>
+      <w:r>
+        <w:t>augustus 1988</w:t>
+      </w:r>
+      <w:r>
+        <w:t>”</w:t>
+      </w:r>
+      <w:r>
+        <w:t xml:space="preserve"> </w:t>
+      </w:r>
+      <w:r>
+        <w:t>versus</w:t>
+      </w:r>
+      <w:r>
+        <w:t xml:space="preserve"> </w:t>
+      </w:r>
+      <w:r>
+        <w:t>to “</w:t>
+      </w:r>
+      <w:r>
+        <w:t>1988</w:t>
+      </w:r>
+      <w:r>
+        <w:t>”</w:t>
+      </w:r>
+      <w:r>
+        <w:t>)</w:t>
+      </w:r>
+      <w:r>
+        <w:t>,</w:t>
+      </w:r>
+      <w:r>
+        <w:t xml:space="preserve"> and </w:t>
+      </w:r>
+      <w:r>
+        <w:t>inconsistent identification of relevant sections</w:t>
+      </w:r>
+      <w:r>
+        <w:t xml:space="preserve"> (</w:t>
+      </w:r>
+      <w:r>
+        <w:t>although the guidelines specified in which sections to annotate, those can be difficult to distinguish in an unstructured block of text).</w:t>
+      </w:r>
+      <w:r>
+        <w:t xml:space="preserve"> </w:t>
+      </w:r>
+      <w:r>
+        <w:t xml:space="preserve">These superficial differences can be </w:t>
+      </w:r>
+      <w:r>
+        <w:t xml:space="preserve">easily fixed with new </w:t>
+      </w:r>
+      <w:r>
+        <w:t xml:space="preserve">standardized </w:t>
+      </w:r>
+      <w:r>
+        <w:t>rule.</w:t>
       </w:r>
     </w:p>
     <w:p>
@@ -2160,166 +2402,345 @@
         <w:spacing w:line="259" w:lineRule="auto"/>
       </w:pPr>
       <w:r>
-        <w:t xml:space="preserve">The annotators resolved their discrepancies by discussing the theses as a group and delivering final annotated versions. With improved </w:t>
-      </w:r>
-      <w:r>
-        <w:t>alignment, they</w:t>
-      </w:r>
-      <w:r>
-        <w:t xml:space="preserve"> each annotated five additional theses. </w:t>
-      </w:r>
-    </w:p>
-    <w:p>
-      <w:pPr>
-        <w:spacing w:line="276" w:lineRule="auto"/>
-      </w:pPr>
-      <w:r>
-        <w:t xml:space="preserve">The results of the test bring forth several observations that have consequences for the knowledge graph. First, the manual annotation processes is not only labor-intensive, but unreliable. The tagging of abstract concepts like the subject of a thesis is highly variable because of the interpretations of different individuals. Second, the annotation procedure exhibited a learning effect. Even with established annotation guidelines, the annotators observed changes as they progressed through five additional theses. As they reviewed more theses, their annotations of each thesis became ____. </w:t>
+        <w:t xml:space="preserve">The labels </w:t>
+      </w:r>
+      <w:r>
+        <w:rPr>
+          <w:i/>
+          <w:iCs/>
+        </w:rPr>
+        <w:t>spatial</w:t>
+      </w:r>
+      <w:r>
+        <w:t xml:space="preserve">, </w:t>
+      </w:r>
+      <w:r>
+        <w:rPr>
+          <w:i/>
+          <w:iCs/>
+        </w:rPr>
+        <w:t>subject</w:t>
+      </w:r>
+      <w:r>
+        <w:t xml:space="preserve">, and </w:t>
+      </w:r>
+      <w:r>
+        <w:rPr>
+          <w:i/>
+          <w:iCs/>
+        </w:rPr>
+        <w:t xml:space="preserve">inGroup </w:t>
+      </w:r>
+      <w:r>
+        <w:t>represent</w:t>
+      </w:r>
+      <w:r>
+        <w:t xml:space="preserve"> the concepts that are most useful to __, but they are abstract and can v</w:t>
+      </w:r>
+      <w:r>
+        <w:t xml:space="preserve">ary according to individual interpretation. Rather than identifying entities, the annotators had to reason about the document as a whole, identifying </w:t>
+      </w:r>
+      <w:r>
+        <w:t xml:space="preserve"> </w:t>
+      </w:r>
+      <w:r>
+        <w:t xml:space="preserve">those entities that were most </w:t>
       </w:r>
       <w:r>
         <w:lastRenderedPageBreak/>
-        <w:t>Theses that were reviewed later were ___, creating uneven training data. As is consistent with findings in othe tasks like [_], models can outdo humans in entity extraction. The need for a model therefore is not motivated just by human factors but by the need to ___..</w:t>
-      </w:r>
-    </w:p>
-    <w:p>
-      <w:r>
-        <w:t xml:space="preserve">To improve the training data, labels were applied to the rest of the thesis, so if a word or multi-word phrase was given a certain label by the annotators, any other appearance of that word or phrase in the text was given the same label. </w:t>
-      </w:r>
-    </w:p>
-    <w:p>
-      <w:pPr>
+        <w:t>important to the study design</w:t>
+      </w:r>
+      <w:r>
+        <w:t>, as well as make decisions about relevance and granularity.</w:t>
+      </w:r>
+      <w:r>
+        <w:t xml:space="preserve"> </w:t>
+      </w:r>
+      <w:r>
+        <w:rPr>
+          <w:highlight w:val="yellow"/>
+        </w:rPr>
+        <w:t>[]</w:t>
+      </w:r>
+      <w:r>
+        <w:t>There are many more entity candidates.</w:t>
+      </w:r>
+    </w:p>
+    <w:p>
+      <w:pPr>
+        <w:spacing w:line="259" w:lineRule="auto"/>
+      </w:pPr>
+      <w:r>
+        <w:t>Where differences occurred</w:t>
+      </w:r>
+      <w:r>
+        <w:t xml:space="preserve"> in the </w:t>
+      </w:r>
+      <w:r>
+        <w:rPr>
+          <w:i/>
+          <w:iCs/>
+        </w:rPr>
+        <w:t>Spatial</w:t>
+      </w:r>
+      <w:r>
+        <w:t xml:space="preserve"> label</w:t>
+      </w:r>
+      <w:r>
+        <w:t xml:space="preserve">, they were caused by </w:t>
+      </w:r>
+      <w:r>
+        <w:t xml:space="preserve">several things. </w:t>
+      </w:r>
+      <w:r>
+        <w:rPr>
+          <w:lang w:val="nl-NL"/>
+        </w:rPr>
+        <w:t>Some labels were annotated based on their relationship to the research project (e.g. “nieuwbouwwijke waar ons onderzoek heeft plaatsgevonden, namelijk Maarssenbroek”), versus just Maarssenbroek</w:t>
+      </w:r>
+      <w:r>
+        <w:rPr>
+          <w:lang w:val="nl-NL"/>
+        </w:rPr>
+        <w:t xml:space="preserve">. </w:t>
+      </w:r>
+      <w:r>
+        <w:t>Some were very conceptual (</w:t>
+      </w:r>
+      <w:r>
+        <w:t>Enquêtegebied</w:t>
+      </w:r>
+      <w:r>
+        <w:t xml:space="preserve"> and </w:t>
+      </w:r>
+      <w:r>
+        <w:t>onderzoeksgebied</w:t>
+      </w:r>
+      <w:r>
+        <w:t xml:space="preserve"> were labeled as spatial, despite a place not specified). Differences often came from different interpretations of granularity. One example is labeling Apledoorn vs. Gemeente appeldoorn. A more extreme example is that one </w:t>
+      </w:r>
+      <w:r>
+        <w:t>annotator</w:t>
+      </w:r>
+      <w:r>
+        <w:t xml:space="preserve"> simply labeled as spatial </w:t>
+      </w:r>
+      <w:r>
+        <w:t xml:space="preserve">Amersfoort </w:t>
+      </w:r>
+      <w:r>
+        <w:t xml:space="preserve">and </w:t>
+      </w:r>
+      <w:r>
+        <w:t>Amersfoort</w:t>
+      </w:r>
+      <w:r>
+        <w:t xml:space="preserve">-Noord, </w:t>
+      </w:r>
+      <w:r>
+        <w:t>versus</w:t>
+      </w:r>
+      <w:r>
+        <w:t xml:space="preserve"> another one that also labeled as spatial the phrase </w:t>
+      </w:r>
+      <w:r>
+        <w:t>“</w:t>
+      </w:r>
+      <w:r>
+        <w:t>h</w:t>
+      </w:r>
+      <w:r>
+        <w:t>et winkel/uitgaansgebied Hof/Krommestraat in Amersfoort</w:t>
+      </w:r>
+      <w:r>
+        <w:t>”</w:t>
+      </w:r>
+      <w:r>
+        <w:t>.</w:t>
+      </w:r>
+      <w:r>
+        <w:t xml:space="preserve"> </w:t>
+      </w:r>
+      <w:r>
+        <w:t xml:space="preserve">Sentences containing the spatial extent being called subjects. Finally, some were clear mistakes (labeling “blijvers” as </w:t>
+      </w:r>
+      <w:r>
+        <w:rPr>
+          <w:i/>
+          <w:iCs/>
+        </w:rPr>
+        <w:t>spatial</w:t>
+      </w:r>
+      <w:r>
+        <w:t>)</w:t>
+      </w:r>
+    </w:p>
+    <w:p>
+      <w:pPr>
+        <w:spacing w:line="259" w:lineRule="auto"/>
+      </w:pPr>
+      <w:r>
+        <w:t>The purpose of diving into these differences is to show that when evaluating a model’s performance against a gold-standard, we need to acknowledge that the gold standard itself may be not trustworthy. Unlike the bibliometric labels, these labels are harder to standardize because they require more rules to address concepts.</w:t>
+      </w:r>
+    </w:p>
+    <w:p>
+      <w:pPr>
+        <w:spacing w:line="259" w:lineRule="auto"/>
+      </w:pPr>
+    </w:p>
+    <w:p>
+      <w:pPr>
+        <w:spacing w:line="259" w:lineRule="auto"/>
+      </w:pPr>
+      <w:r>
+        <w:rPr>
+          <w:highlight w:val="magenta"/>
+        </w:rPr>
+        <w:t>Choose broader vs narrower terms</w:t>
+      </w:r>
+    </w:p>
+    <w:p>
+      <w:pPr>
+        <w:spacing w:line="259" w:lineRule="auto"/>
+        <w:jc w:val="left"/>
+        <w:rPr>
+          <w:highlight w:val="magenta"/>
+        </w:rPr>
+      </w:pPr>
+      <w:r>
+        <w:rPr>
+          <w:highlight w:val="magenta"/>
+        </w:rPr>
+        <w:t xml:space="preserve">This makes the task </w:t>
+      </w:r>
+      <w:r>
         <w:rPr>
           <w:b/>
           <w:bCs/>
-        </w:rPr>
-      </w:pPr>
+          <w:highlight w:val="magenta"/>
+        </w:rPr>
+        <w:t>operationally defined</w:t>
+      </w:r>
+      <w:r>
+        <w:rPr>
+          <w:highlight w:val="magenta"/>
+        </w:rPr>
+        <w:t>, even if not philosophically objective.</w:t>
+      </w:r>
+    </w:p>
+    <w:p>
+      <w:pPr>
+        <w:spacing w:line="259" w:lineRule="auto"/>
+        <w:jc w:val="left"/>
+      </w:pPr>
+      <w:r>
+        <w:rPr>
+          <w:highlight w:val="magenta"/>
+        </w:rPr>
+        <w:t>If agreement is high → task is reasonably well-defined.</w:t>
+      </w:r>
+      <w:r>
+        <w:rPr>
+          <w:highlight w:val="magenta"/>
+        </w:rPr>
+        <w:br/>
+        <w:t>If agreement is low → the concept itself is unstable.</w:t>
+      </w:r>
+    </w:p>
+    <w:p>
+      <w:pPr>
+        <w:spacing w:line="259" w:lineRule="auto"/>
+        <w:rPr>
+          <w:highlight w:val="magenta"/>
+        </w:rPr>
+      </w:pPr>
+      <w:r>
+        <w:rPr>
+          <w:highlight w:val="magenta"/>
+        </w:rPr>
+        <w:t xml:space="preserve">Your evaluation is now bounded by </w:t>
+      </w:r>
       <w:r>
         <w:rPr>
           <w:b/>
           <w:bCs/>
-        </w:rPr>
-        <w:t>Test dataset</w:t>
-      </w:r>
-    </w:p>
-    <w:p>
-      <w:r>
-        <w:t xml:space="preserve">The </w:t>
-      </w:r>
-      <w:r>
-        <w:t xml:space="preserve">observed </w:t>
-      </w:r>
-      <w:r>
-        <w:t xml:space="preserve">learning effect and the low inter-annotator agreement precluded a high-quality </w:t>
-      </w:r>
-      <w:r>
-        <w:t>reliable</w:t>
-      </w:r>
-      <w:r>
-        <w:t xml:space="preserve"> dataset for</w:t>
-      </w:r>
-      <w:r>
-        <w:t xml:space="preserve"> reporting final performance metrics.</w:t>
-      </w:r>
-      <w:r>
-        <w:t xml:space="preserve"> To establish </w:t>
-      </w:r>
-      <w:r>
-        <w:t xml:space="preserve">this ground-truth </w:t>
-      </w:r>
-      <w:r>
-        <w:t>dataset</w:t>
-      </w:r>
-      <w:r>
-        <w:t>,</w:t>
-      </w:r>
-      <w:r>
-        <w:t xml:space="preserve"> the annotation process concluded with a </w:t>
-      </w:r>
-      <w:r>
-        <w:t>detailed</w:t>
-      </w:r>
-      <w:r>
-        <w:t xml:space="preserve"> </w:t>
-      </w:r>
-      <w:r>
-        <w:t xml:space="preserve">review of four additional theses. </w:t>
-      </w:r>
-      <w:r>
-        <w:t>A</w:t>
-      </w:r>
-      <w:r>
-        <w:t xml:space="preserve">nnotation </w:t>
-      </w:r>
-      <w:r>
-        <w:t>task</w:t>
-      </w:r>
-      <w:r>
-        <w:t>s</w:t>
-      </w:r>
-      <w:r>
-        <w:t xml:space="preserve"> </w:t>
-      </w:r>
-      <w:r>
-        <w:t>were</w:t>
-      </w:r>
-      <w:r>
-        <w:t xml:space="preserve"> </w:t>
-      </w:r>
-      <w:r>
-        <w:t>evenly</w:t>
-      </w:r>
-      <w:r>
-        <w:t xml:space="preserve"> divided between two subject matter experts, who </w:t>
-      </w:r>
-      <w:r>
-        <w:t>subsequently</w:t>
-      </w:r>
-      <w:r>
-        <w:t xml:space="preserve"> </w:t>
-      </w:r>
-      <w:r>
-        <w:t>compared their results, discussed discrepancies, and reached</w:t>
-      </w:r>
-      <w:r>
-        <w:t xml:space="preserve"> consensus. The </w:t>
-      </w:r>
-      <w:r>
-        <w:t>labels</w:t>
-      </w:r>
-      <w:r>
-        <w:t xml:space="preserve"> were </w:t>
-      </w:r>
-      <w:r>
-        <w:t>revised</w:t>
-      </w:r>
-      <w:r>
-        <w:t xml:space="preserve"> based on their </w:t>
-      </w:r>
-      <w:r>
-        <w:t>joint</w:t>
-      </w:r>
-      <w:r>
-        <w:t xml:space="preserve"> judgment</w:t>
-      </w:r>
-      <w:r>
-        <w:t xml:space="preserve">, resulting in a gold standard </w:t>
-      </w:r>
-      <w:r>
-        <w:t xml:space="preserve">that </w:t>
-      </w:r>
-      <w:r>
-        <w:t>reflects the highest attainable quality through expert deliberation.</w:t>
-      </w:r>
-      <w:r>
-        <w:t xml:space="preserve"> </w:t>
-      </w:r>
-      <w:r>
-        <w:t>This dataset is referred to as the test set.</w:t>
-      </w:r>
-    </w:p>
-    <w:p/>
-    <w:p>
-      <w:pPr>
+          <w:highlight w:val="magenta"/>
+        </w:rPr>
+        <w:t>the human agreement ceiling</w:t>
+      </w:r>
+      <w:r>
+        <w:rPr>
+          <w:highlight w:val="magenta"/>
+        </w:rPr>
+        <w:t>: a model that matches one annotator perfectly might still score poorly against another annotator’s choices.</w:t>
+      </w:r>
+    </w:p>
+    <w:p>
+      <w:pPr>
+        <w:spacing w:line="259" w:lineRule="auto"/>
+      </w:pPr>
+      <w:r>
+        <w:rPr>
+          <w:highlight w:val="magenta"/>
+        </w:rPr>
+        <w:t>“Inter-annotator agreement was Cohen’s kappa = 0.303, reflecting the inherent subjectivity of identifying explicit subject keywords.”</w:t>
+      </w:r>
+    </w:p>
+    <w:p>
+      <w:pPr>
+        <w:spacing w:line="259" w:lineRule="auto"/>
+      </w:pPr>
+    </w:p>
+    <w:p>
+      <w:pPr>
+        <w:spacing w:line="259" w:lineRule="auto"/>
+      </w:pPr>
+      <w:r>
+        <w:t>Examples of locations that should NOT be labeled are here:</w:t>
+      </w:r>
+    </w:p>
+    <w:p>
+      <w:pPr>
+        <w:spacing w:line="259" w:lineRule="auto"/>
+        <w:rPr>
+          <w:lang w:val="nl-NL"/>
+        </w:rPr>
+      </w:pPr>
+      <w:r>
+        <w:rPr>
+          <w:highlight w:val="yellow"/>
+          <w:lang w:val="nl-NL"/>
+        </w:rPr>
+        <w:t>Dit waren: Overvecht, Lunetten (twee buitenwijken van Utrecht), Nieuwegein (een groeikern in de buurt van Utrecht), en Maarssenbroek (een 'illegale’ groeikern tussen Utrecht en Amsterdam).</w:t>
+      </w:r>
+    </w:p>
+    <w:p>
+      <w:pPr>
+        <w:spacing w:line="259" w:lineRule="auto"/>
+        <w:rPr>
+          <w:lang w:val="nl-NL"/>
+        </w:rPr>
+      </w:pPr>
+    </w:p>
+    <w:p>
+      <w:pPr>
+        <w:spacing w:line="259" w:lineRule="auto"/>
+      </w:pPr>
+      <w:r>
+        <w:t xml:space="preserve">The tagging of abstract concepts like the subject of a thesis is highly variable because of the interpretations of different individuals. </w:t>
+      </w:r>
+      <w:r>
+        <w:t>Superficial differences came from include articles or not (die/het).</w:t>
+      </w:r>
+    </w:p>
+    <w:p>
+      <w:pPr>
+        <w:spacing w:line="259" w:lineRule="auto"/>
+      </w:pPr>
+    </w:p>
+    <w:p>
+      <w:pPr>
+        <w:spacing w:line="259" w:lineRule="auto"/>
         <w:rPr>
           <w:b/>
           <w:bCs/>
@@ -2330,6 +2751,216 @@
           <w:b/>
           <w:bCs/>
         </w:rPr>
+        <w:t>In Subject</w:t>
+      </w:r>
+    </w:p>
+    <w:p>
+      <w:pPr>
+        <w:spacing w:line="259" w:lineRule="auto"/>
+        <w:rPr>
+          <w:b/>
+          <w:bCs/>
+        </w:rPr>
+      </w:pPr>
+      <w:r>
+        <w:rPr>
+          <w:b/>
+          <w:bCs/>
+        </w:rPr>
+        <w:t>In inGroup</w:t>
+      </w:r>
+    </w:p>
+    <w:p>
+      <w:pPr>
+        <w:spacing w:line="259" w:lineRule="auto"/>
+      </w:pPr>
+    </w:p>
+    <w:p>
+      <w:pPr>
+        <w:spacing w:line="259" w:lineRule="auto"/>
+      </w:pPr>
+    </w:p>
+    <w:p>
+      <w:pPr>
+        <w:spacing w:line="259" w:lineRule="auto"/>
+      </w:pPr>
+      <w:r>
+        <w:t>After the completion of the experiment, t</w:t>
+      </w:r>
+      <w:r>
+        <w:t>he annotators resolved their discrepancies by discussing the</w:t>
+      </w:r>
+      <w:r>
+        <w:t>m</w:t>
+      </w:r>
+      <w:r>
+        <w:t xml:space="preserve"> as a group and </w:t>
+      </w:r>
+      <w:r>
+        <w:t>choosing which labels to include in the</w:t>
+      </w:r>
+      <w:r>
+        <w:t xml:space="preserve"> final annotated </w:t>
+      </w:r>
+      <w:r>
+        <w:t>version</w:t>
+      </w:r>
+      <w:r>
+        <w:t xml:space="preserve">. With improved </w:t>
+      </w:r>
+      <w:r>
+        <w:t>alignment</w:t>
+      </w:r>
+      <w:r>
+        <w:t xml:space="preserve"> in their interpretations</w:t>
+      </w:r>
+      <w:r>
+        <w:t>, they</w:t>
+      </w:r>
+      <w:r>
+        <w:t xml:space="preserve"> each annotated five additional theses.</w:t>
+      </w:r>
+    </w:p>
+    <w:p>
+      <w:pPr>
+        <w:spacing w:line="259" w:lineRule="auto"/>
+      </w:pPr>
+    </w:p>
+    <w:p>
+      <w:pPr>
+        <w:spacing w:line="259" w:lineRule="auto"/>
+      </w:pPr>
+      <w:r>
+        <w:t>In addition, the annotation procedure exhibited a learning effect. E</w:t>
+      </w:r>
+      <w:r>
+        <w:rPr>
+          <w:highlight w:val="yellow"/>
+        </w:rPr>
+        <w:t>ven with established annotation guidelines, the annotators observed changes as they progressed through five additional theses. As they reviewed more theses, their annotations of each thesis became ____. Theses that were reviewed later were ___, creating uneven training data. As is consistent with findings in othe tasks like [_], models can outdo humans in entity extraction. The need for a model therefore is not motivated just by human factors but by the need to ___..</w:t>
+      </w:r>
+    </w:p>
+    <w:p>
+      <w:pPr>
+        <w:spacing w:line="276" w:lineRule="auto"/>
+      </w:pPr>
+      <w:r>
+        <w:t xml:space="preserve">The results of the test bring forth several observations that have consequences for the knowledge graph. First, the manual annotation processes is not only labor-intensive, but unreliable. </w:t>
+      </w:r>
+    </w:p>
+    <w:p>
+      <w:r>
+        <w:t xml:space="preserve">To improve the training data, labels were applied to the rest of the thesis, so if a word or multi-word phrase was given a certain label by the annotators, any other appearance of that word or phrase in the text was given the same label. </w:t>
+      </w:r>
+    </w:p>
+    <w:p>
+      <w:pPr>
+        <w:rPr>
+          <w:b/>
+          <w:bCs/>
+        </w:rPr>
+      </w:pPr>
+      <w:r>
+        <w:rPr>
+          <w:b/>
+          <w:bCs/>
+        </w:rPr>
+        <w:t>Test dataset</w:t>
+      </w:r>
+    </w:p>
+    <w:p>
+      <w:r>
+        <w:t xml:space="preserve">The observed learning effect and the low inter-annotator agreement precluded a high-quality reliable dataset for reporting final performance metrics. To establish </w:t>
+      </w:r>
+      <w:r>
+        <w:t xml:space="preserve">this ground-truth </w:t>
+      </w:r>
+      <w:r>
+        <w:t>dataset, the annotation process concluded with a detailed</w:t>
+      </w:r>
+      <w:r>
+        <w:t xml:space="preserve"> </w:t>
+      </w:r>
+      <w:r>
+        <w:t xml:space="preserve">review of four additional theses. </w:t>
+      </w:r>
+      <w:r>
+        <w:t>A</w:t>
+      </w:r>
+      <w:r>
+        <w:t>nnotation task</w:t>
+      </w:r>
+      <w:r>
+        <w:t>s</w:t>
+      </w:r>
+      <w:r>
+        <w:t xml:space="preserve"> </w:t>
+      </w:r>
+      <w:r>
+        <w:t>were</w:t>
+      </w:r>
+      <w:r>
+        <w:t xml:space="preserve"> evenly divided between two subject matter experts, who </w:t>
+      </w:r>
+      <w:r>
+        <w:t>subsequently</w:t>
+      </w:r>
+      <w:r>
+        <w:t xml:space="preserve"> </w:t>
+      </w:r>
+      <w:r>
+        <w:t>compared their results, discussed discrepancies, and reached</w:t>
+      </w:r>
+      <w:r>
+        <w:t xml:space="preserve"> consensus. The </w:t>
+      </w:r>
+      <w:r>
+        <w:t>labels</w:t>
+      </w:r>
+      <w:r>
+        <w:t xml:space="preserve"> were </w:t>
+      </w:r>
+      <w:r>
+        <w:t>revised</w:t>
+      </w:r>
+      <w:r>
+        <w:t xml:space="preserve"> based on their </w:t>
+      </w:r>
+      <w:r>
+        <w:t>joint</w:t>
+      </w:r>
+      <w:r>
+        <w:t xml:space="preserve"> judgment</w:t>
+      </w:r>
+      <w:r>
+        <w:t xml:space="preserve">, resulting in a gold standard </w:t>
+      </w:r>
+      <w:r>
+        <w:t xml:space="preserve">that </w:t>
+      </w:r>
+      <w:r>
+        <w:t>reflects the highest attainable quality through expert deliberation.</w:t>
+      </w:r>
+      <w:r>
+        <w:t xml:space="preserve"> </w:t>
+      </w:r>
+      <w:r>
+        <w:t>This dataset is referred to as the test set.</w:t>
+      </w:r>
+    </w:p>
+    <w:p/>
+    <w:p>
+      <w:pPr>
+        <w:rPr>
+          <w:b/>
+          <w:bCs/>
+        </w:rPr>
+      </w:pPr>
+      <w:r>
+        <w:rPr>
+          <w:b/>
+          <w:bCs/>
+        </w:rPr>
         <w:t>Archive</w:t>
       </w:r>
     </w:p>
@@ -2350,7 +2981,13 @@
         <w:t xml:space="preserve"> excluded </w:t>
       </w:r>
       <w:r>
-        <w:t xml:space="preserve">to streamline model development into one language. </w:t>
+        <w:t xml:space="preserve">to streamline model development </w:t>
+      </w:r>
+      <w:r>
+        <w:t>to</w:t>
+      </w:r>
+      <w:r>
+        <w:t xml:space="preserve"> one language. </w:t>
       </w:r>
       <w:r>
         <w:t>The result ____ theses.</w:t>
@@ -2363,7 +3000,11 @@
         <w:t xml:space="preserve">This separation aligns with our conceptual understanding of objective and subjective labels. </w:t>
       </w:r>
     </w:p>
-    <w:p/>
+    <w:p>
+      <w:r>
+        <w:t>Clearly, these subjective annotations don’t align with string-matching based evaluation.</w:t>
+      </w:r>
+    </w:p>
     <w:sectPr>
       <w:pgSz w:w="12240" w:h="15840"/>
       <w:pgMar w:top="1440" w:right="1440" w:bottom="1440" w:left="1440" w:header="720" w:footer="720" w:gutter="0"/>
@@ -2415,8 +3056,8 @@
 
 <file path=word/commentsExtended.xml><?xml version="1.0" encoding="utf-8"?>
 <w15:commentsEx xmlns:wpc="http://schemas.microsoft.com/office/word/2010/wordprocessingCanvas" xmlns:cx="http://schemas.microsoft.com/office/drawing/2014/chartex" xmlns:cx1="http://schemas.microsoft.com/office/drawing/2015/9/8/chartex" xmlns:cx2="http://schemas.microsoft.com/office/drawing/2015/10/21/chartex" xmlns:cx3="http://schemas.microsoft.com/office/drawing/2016/5/9/chartex" xmlns:cx4="http://schemas.microsoft.com/office/drawing/2016/5/10/chartex" xmlns:cx5="http://schemas.microsoft.com/office/drawing/2016/5/11/chartex" xmlns:cx6="http://schemas.microsoft.com/office/drawing/2016/5/12/chartex" xmlns:cx7="http://schemas.microsoft.com/office/drawing/2016/5/13/chartex" xmlns:cx8="http://schemas.microsoft.com/office/drawing/2016/5/14/chartex" xmlns:mc="http://schemas.openxmlformats.org/markup-compatibility/2006" xmlns:aink="http://schemas.microsoft.com/office/drawing/2016/ink" xmlns:am3d="http://schemas.microsoft.com/office/drawing/2017/model3d" xmlns:o="urn:schemas-microsoft-com:office:office" xmlns:oel="http://schemas.microsoft.com/office/2019/extlst" xmlns:r="http://schemas.openxmlformats.org/officeDocument/2006/relationships" xmlns:m="http://schemas.openxmlformats.org/officeDocument/2006/math" xmlns:v="urn:schemas-microsoft-com:vml" xmlns:wp14="http://schemas.microsoft.com/office/word/2010/wordprocessingDrawing" xmlns:wp="http://schemas.openxmlformats.org/drawingml/2006/wordprocessingDrawing" xmlns:w10="urn:schemas-microsoft-com:office:word" xmlns:w="http://schemas.openxmlformats.org/wordprocessingml/2006/main" xmlns:w14="http://schemas.microsoft.com/office/word/2010/wordml" xmlns:w15="http://schemas.microsoft.com/office/word/2012/wordml" xmlns:w16cex="http://schemas.microsoft.com/office/word/2018/wordml/cex" xmlns:w16cid="http://schemas.microsoft.com/office/word/2016/wordml/cid" xmlns:w16="http://schemas.microsoft.com/office/word/2018/wordml" xmlns:w16du="http://schemas.microsoft.com/office/word/2023/wordml/word16du" xmlns:w16sdtdh="http://schemas.microsoft.com/office/word/2020/wordml/sdtdatahash" xmlns:w16sdtfl="http://schemas.microsoft.com/office/word/2024/wordml/sdtformatlock" xmlns:w16se="http://schemas.microsoft.com/office/word/2015/wordml/symex" xmlns:wpg="http://schemas.microsoft.com/office/word/2010/wordprocessingGroup" xmlns:wpi="http://schemas.microsoft.com/office/word/2010/wordprocessingInk" xmlns:wne="http://schemas.microsoft.com/office/word/2006/wordml" xmlns:wps="http://schemas.microsoft.com/office/word/2010/wordprocessingShape" mc:Ignorable="w14 w15 w16se w16cid w16 w16cex w16sdtdh w16sdtfl w16du wp14">
-  <w15:commentEx w15:paraId="326AF59A" w15:done="0"/>
-  <w15:commentEx w15:paraId="4C5CE1F9" w15:done="0"/>
+  <w15:commentEx w15:paraId="326AF59A" w15:done="1"/>
+  <w15:commentEx w15:paraId="4C5CE1F9" w15:done="1"/>
 </w15:commentsEx>
 </file>
 
@@ -2618,8 +3259,100 @@
       </w:rPr>
     </w:lvl>
   </w:abstractNum>
+  <w:abstractNum w:abstractNumId="1" w15:restartNumberingAfterBreak="0">
+    <w:nsid w:val="6BDB6CEC"/>
+    <w:multiLevelType w:val="hybridMultilevel"/>
+    <w:tmpl w:val="424E350C"/>
+    <w:lvl w:ilvl="0" w:tplc="0409000F">
+      <w:start w:val="1"/>
+      <w:numFmt w:val="decimal"/>
+      <w:lvlText w:val="%1."/>
+      <w:lvlJc w:val="left"/>
+      <w:pPr>
+        <w:ind w:left="720" w:hanging="360"/>
+      </w:pPr>
+      <w:rPr>
+        <w:rFonts w:hint="default"/>
+      </w:rPr>
+    </w:lvl>
+    <w:lvl w:ilvl="1" w:tplc="04090019" w:tentative="1">
+      <w:start w:val="1"/>
+      <w:numFmt w:val="lowerLetter"/>
+      <w:lvlText w:val="%2."/>
+      <w:lvlJc w:val="left"/>
+      <w:pPr>
+        <w:ind w:left="1440" w:hanging="360"/>
+      </w:pPr>
+    </w:lvl>
+    <w:lvl w:ilvl="2" w:tplc="0409001B" w:tentative="1">
+      <w:start w:val="1"/>
+      <w:numFmt w:val="lowerRoman"/>
+      <w:lvlText w:val="%3."/>
+      <w:lvlJc w:val="right"/>
+      <w:pPr>
+        <w:ind w:left="2160" w:hanging="180"/>
+      </w:pPr>
+    </w:lvl>
+    <w:lvl w:ilvl="3" w:tplc="0409000F" w:tentative="1">
+      <w:start w:val="1"/>
+      <w:numFmt w:val="decimal"/>
+      <w:lvlText w:val="%4."/>
+      <w:lvlJc w:val="left"/>
+      <w:pPr>
+        <w:ind w:left="2880" w:hanging="360"/>
+      </w:pPr>
+    </w:lvl>
+    <w:lvl w:ilvl="4" w:tplc="04090019" w:tentative="1">
+      <w:start w:val="1"/>
+      <w:numFmt w:val="lowerLetter"/>
+      <w:lvlText w:val="%5."/>
+      <w:lvlJc w:val="left"/>
+      <w:pPr>
+        <w:ind w:left="3600" w:hanging="360"/>
+      </w:pPr>
+    </w:lvl>
+    <w:lvl w:ilvl="5" w:tplc="0409001B" w:tentative="1">
+      <w:start w:val="1"/>
+      <w:numFmt w:val="lowerRoman"/>
+      <w:lvlText w:val="%6."/>
+      <w:lvlJc w:val="right"/>
+      <w:pPr>
+        <w:ind w:left="4320" w:hanging="180"/>
+      </w:pPr>
+    </w:lvl>
+    <w:lvl w:ilvl="6" w:tplc="0409000F" w:tentative="1">
+      <w:start w:val="1"/>
+      <w:numFmt w:val="decimal"/>
+      <w:lvlText w:val="%7."/>
+      <w:lvlJc w:val="left"/>
+      <w:pPr>
+        <w:ind w:left="5040" w:hanging="360"/>
+      </w:pPr>
+    </w:lvl>
+    <w:lvl w:ilvl="7" w:tplc="04090019" w:tentative="1">
+      <w:start w:val="1"/>
+      <w:numFmt w:val="lowerLetter"/>
+      <w:lvlText w:val="%8."/>
+      <w:lvlJc w:val="left"/>
+      <w:pPr>
+        <w:ind w:left="5760" w:hanging="360"/>
+      </w:pPr>
+    </w:lvl>
+    <w:lvl w:ilvl="8" w:tplc="0409001B" w:tentative="1">
+      <w:start w:val="1"/>
+      <w:numFmt w:val="lowerRoman"/>
+      <w:lvlText w:val="%9."/>
+      <w:lvlJc w:val="right"/>
+      <w:pPr>
+        <w:ind w:left="6480" w:hanging="180"/>
+      </w:pPr>
+    </w:lvl>
+  </w:abstractNum>
   <w:num w:numId="1" w16cid:durableId="704910522">
     <w:abstractNumId w:val="0"/>
+  </w:num>
+  <w:num w:numId="2" w16cid:durableId="2029409646">
+    <w:abstractNumId w:val="1"/>
   </w:num>
 </w:numbering>
 </file>
@@ -3242,6 +3975,7 @@
   <w:style w:type="character" w:default="1" w:styleId="DefaultParagraphFont">
     <w:name w:val="Default Paragraph Font"/>
     <w:uiPriority w:val="1"/>
+    <w:semiHidden/>
     <w:unhideWhenUsed/>
   </w:style>
   <w:style w:type="table" w:default="1" w:styleId="TableNormal">
@@ -3998,4 +4732,16 @@
     </a:ext>
   </a:extLst>
 </a:theme>
+</file>
+
+<file path=customXml/item1.xml><?xml version="1.0" encoding="utf-8"?>
+<b:Sources xmlns:b="http://schemas.openxmlformats.org/officeDocument/2006/bibliography" xmlns="http://schemas.openxmlformats.org/officeDocument/2006/bibliography" SelectedStyle="\APASixthEditionOfficeOnline.xsl" StyleName="APA" Version="6"/>
+</file>
+
+<file path=customXml/itemProps1.xml><?xml version="1.0" encoding="utf-8"?>
+<ds:datastoreItem xmlns:ds="http://schemas.openxmlformats.org/officeDocument/2006/customXml" ds:itemID="{41663D55-F6D8-41C4-92E3-9CCCBEBB087E}">
+  <ds:schemaRefs>
+    <ds:schemaRef ds:uri="http://schemas.openxmlformats.org/officeDocument/2006/bibliography"/>
+  </ds:schemaRefs>
+</ds:datastoreItem>
 </file>
</xml_diff>